<commit_message>
release: first version for presentation tomorrow.
</commit_message>
<xml_diff>
--- a/02-Documentation/02-requirements/preguntas-de-analisis.docx
+++ b/02-Documentation/02-requirements/preguntas-de-analisis.docx
@@ -1,10 +1,10 @@
 
 <file path=word/document.xml><?xml version="1.0" encoding="utf-8"?>
-<w:document xmlns:wpc="http://schemas.microsoft.com/office/word/2010/wordprocessingCanvas" xmlns:cx="http://schemas.microsoft.com/office/drawing/2014/chartex" xmlns:cx1="http://schemas.microsoft.com/office/drawing/2015/9/8/chartex" xmlns:cx2="http://schemas.microsoft.com/office/drawing/2015/10/21/chartex" xmlns:cx3="http://schemas.microsoft.com/office/drawing/2016/5/9/chartex" xmlns:cx4="http://schemas.microsoft.com/office/drawing/2016/5/10/chartex" xmlns:cx5="http://schemas.microsoft.com/office/drawing/2016/5/11/chartex" xmlns:cx6="http://schemas.microsoft.com/office/drawing/2016/5/12/chartex" xmlns:cx7="http://schemas.microsoft.com/office/drawing/2016/5/13/chartex" xmlns:cx8="http://schemas.microsoft.com/office/drawing/2016/5/14/chartex" xmlns:mc="http://schemas.openxmlformats.org/markup-compatibility/2006" xmlns:aink="http://schemas.microsoft.com/office/drawing/2016/ink" xmlns:am3d="http://schemas.microsoft.com/office/drawing/2017/model3d" xmlns:o="urn:schemas-microsoft-com:office:office" xmlns:r="http://schemas.openxmlformats.org/officeDocument/2006/relationships" xmlns:m="http://schemas.openxmlformats.org/officeDocument/2006/math" xmlns:v="urn:schemas-microsoft-com:vml" xmlns:wp14="http://schemas.microsoft.com/office/word/2010/wordprocessingDrawing" xmlns:wp="http://schemas.openxmlformats.org/drawingml/2006/wordprocessingDrawing" xmlns:w10="urn:schemas-microsoft-com:office:word" xmlns:w="http://schemas.openxmlformats.org/wordprocessingml/2006/main" xmlns:w14="http://schemas.microsoft.com/office/word/2010/wordml" xmlns:w15="http://schemas.microsoft.com/office/word/2012/wordml" xmlns:w16cex="http://schemas.microsoft.com/office/word/2018/wordml/cex" xmlns:w16cid="http://schemas.microsoft.com/office/word/2016/wordml/cid" xmlns:w16="http://schemas.microsoft.com/office/word/2018/wordml" xmlns:w16sdtdh="http://schemas.microsoft.com/office/word/2020/wordml/sdtdatahash" xmlns:w16se="http://schemas.microsoft.com/office/word/2015/wordml/symex" xmlns:wpg="http://schemas.microsoft.com/office/word/2010/wordprocessingGroup" xmlns:wpi="http://schemas.microsoft.com/office/word/2010/wordprocessingInk" xmlns:wne="http://schemas.microsoft.com/office/word/2006/wordml" xmlns:wps="http://schemas.microsoft.com/office/word/2010/wordprocessingShape" mc:Ignorable="w14 w15 w16se w16cid w16 w16cex w16sdtdh wp14">
+<w:document xmlns:wpc="http://schemas.microsoft.com/office/word/2010/wordprocessingCanvas" xmlns:cx="http://schemas.microsoft.com/office/drawing/2014/chartex" xmlns:cx1="http://schemas.microsoft.com/office/drawing/2015/9/8/chartex" xmlns:cx2="http://schemas.microsoft.com/office/drawing/2015/10/21/chartex" xmlns:cx3="http://schemas.microsoft.com/office/drawing/2016/5/9/chartex" xmlns:cx4="http://schemas.microsoft.com/office/drawing/2016/5/10/chartex" xmlns:cx5="http://schemas.microsoft.com/office/drawing/2016/5/11/chartex" xmlns:cx6="http://schemas.microsoft.com/office/drawing/2016/5/12/chartex" xmlns:cx7="http://schemas.microsoft.com/office/drawing/2016/5/13/chartex" xmlns:cx8="http://schemas.microsoft.com/office/drawing/2016/5/14/chartex" xmlns:mc="http://schemas.openxmlformats.org/markup-compatibility/2006" xmlns:aink="http://schemas.microsoft.com/office/drawing/2016/ink" xmlns:am3d="http://schemas.microsoft.com/office/drawing/2017/model3d" xmlns:o="urn:schemas-microsoft-com:office:office" xmlns:r="http://schemas.openxmlformats.org/officeDocument/2006/relationships" xmlns:m="http://schemas.openxmlformats.org/officeDocument/2006/math" xmlns:v="urn:schemas-microsoft-com:vml" xmlns:wp14="http://schemas.microsoft.com/office/word/2010/wordprocessingDrawing" xmlns:wp="http://schemas.openxmlformats.org/drawingml/2006/wordprocessingDrawing" xmlns:w10="urn:schemas-microsoft-com:office:word" xmlns:w="http://schemas.openxmlformats.org/wordprocessingml/2006/main" xmlns:w14="http://schemas.microsoft.com/office/word/2010/wordml" xmlns:w15="http://schemas.microsoft.com/office/word/2012/wordml" xmlns:w16cid="http://schemas.microsoft.com/office/word/2016/wordml/cid" xmlns:w16se="http://schemas.microsoft.com/office/word/2015/wordml/symex" xmlns:wpg="http://schemas.microsoft.com/office/word/2010/wordprocessingGroup" xmlns:wpi="http://schemas.microsoft.com/office/word/2010/wordprocessingInk" xmlns:wne="http://schemas.microsoft.com/office/word/2006/wordml" xmlns:wps="http://schemas.microsoft.com/office/word/2010/wordprocessingShape" mc:Ignorable="w14 w15 w16se w16cid wp14">
   <w:body>
     <w:p>
       <w:pPr>
-        <w:jc w:val="center"/>
+        <w:jc w:val="both"/>
         <w:rPr>
           <w:rFonts w:ascii="Arial" w:hAnsi="Arial" w:cs="Arial"/>
           <w:b/>
@@ -25,6 +25,7 @@
     <w:p>
       <w:pPr>
         <w:spacing w:before="100" w:beforeAutospacing="1" w:after="100" w:afterAutospacing="1" w:line="240" w:lineRule="auto"/>
+        <w:jc w:val="both"/>
         <w:rPr>
           <w:rFonts w:ascii="Arial" w:eastAsia="Times New Roman" w:hAnsi="Arial" w:cs="Arial"/>
           <w:kern w:val="0"/>
@@ -65,6 +66,7 @@
     <w:p>
       <w:pPr>
         <w:spacing w:before="100" w:beforeAutospacing="1" w:after="100" w:afterAutospacing="1" w:line="240" w:lineRule="auto"/>
+        <w:jc w:val="both"/>
         <w:rPr>
           <w:rFonts w:ascii="Arial" w:eastAsia="Times New Roman" w:hAnsi="Arial" w:cs="Arial"/>
           <w:kern w:val="0"/>
@@ -101,10 +103,13 @@
         </w:rPr>
         <w:t xml:space="preserve"> El sistema debe permitir a los usuarios iniciar sesión mediante usuario y contraseña. </w:t>
       </w:r>
+      <w:bookmarkStart w:id="0" w:name="_GoBack"/>
+      <w:bookmarkEnd w:id="0"/>
     </w:p>
     <w:p>
       <w:pPr>
         <w:spacing w:before="100" w:beforeAutospacing="1" w:after="100" w:afterAutospacing="1" w:line="240" w:lineRule="auto"/>
+        <w:jc w:val="both"/>
         <w:rPr>
           <w:rFonts w:ascii="Arial" w:eastAsia="Times New Roman" w:hAnsi="Arial" w:cs="Arial"/>
           <w:kern w:val="0"/>
@@ -145,6 +150,7 @@
     <w:p>
       <w:pPr>
         <w:spacing w:before="100" w:beforeAutospacing="1" w:after="100" w:afterAutospacing="1" w:line="240" w:lineRule="auto"/>
+        <w:jc w:val="both"/>
         <w:rPr>
           <w:rFonts w:ascii="Arial" w:eastAsia="Times New Roman" w:hAnsi="Arial" w:cs="Arial"/>
           <w:kern w:val="0"/>
@@ -185,6 +191,7 @@
     <w:p>
       <w:pPr>
         <w:spacing w:before="100" w:beforeAutospacing="1" w:after="100" w:afterAutospacing="1" w:line="240" w:lineRule="auto"/>
+        <w:jc w:val="both"/>
         <w:rPr>
           <w:rFonts w:ascii="Arial" w:eastAsia="Times New Roman" w:hAnsi="Arial" w:cs="Arial"/>
           <w:kern w:val="0"/>
@@ -225,6 +232,7 @@
     <w:p>
       <w:pPr>
         <w:spacing w:before="100" w:beforeAutospacing="1" w:after="100" w:afterAutospacing="1" w:line="240" w:lineRule="auto"/>
+        <w:jc w:val="both"/>
         <w:rPr>
           <w:rFonts w:ascii="Arial" w:eastAsia="Times New Roman" w:hAnsi="Arial" w:cs="Arial"/>
           <w:kern w:val="0"/>
@@ -265,6 +273,7 @@
     <w:p>
       <w:pPr>
         <w:spacing w:before="100" w:beforeAutospacing="1" w:after="100" w:afterAutospacing="1" w:line="240" w:lineRule="auto"/>
+        <w:jc w:val="both"/>
         <w:rPr>
           <w:rFonts w:ascii="Arial" w:eastAsia="Times New Roman" w:hAnsi="Arial" w:cs="Arial"/>
           <w:kern w:val="0"/>
@@ -305,6 +314,7 @@
     <w:p>
       <w:pPr>
         <w:spacing w:before="100" w:beforeAutospacing="1" w:after="100" w:afterAutospacing="1" w:line="240" w:lineRule="auto"/>
+        <w:jc w:val="both"/>
         <w:rPr>
           <w:rFonts w:ascii="Arial" w:eastAsia="Times New Roman" w:hAnsi="Arial" w:cs="Arial"/>
           <w:kern w:val="0"/>
@@ -344,14 +354,7 @@
     </w:p>
     <w:p>
       <w:pPr>
-        <w:rPr>
-          <w:rFonts w:ascii="Arial" w:hAnsi="Arial" w:cs="Arial"/>
-        </w:rPr>
-      </w:pPr>
-    </w:p>
-    <w:p>
-      <w:pPr>
-        <w:jc w:val="center"/>
+        <w:jc w:val="both"/>
         <w:rPr>
           <w:rFonts w:ascii="Arial" w:hAnsi="Arial" w:cs="Arial"/>
           <w:b/>
@@ -370,6 +373,7 @@
     <w:p>
       <w:pPr>
         <w:spacing w:before="100" w:beforeAutospacing="1" w:after="100" w:afterAutospacing="1" w:line="240" w:lineRule="auto"/>
+        <w:jc w:val="both"/>
         <w:rPr>
           <w:rFonts w:ascii="Arial" w:eastAsia="Times New Roman" w:hAnsi="Arial" w:cs="Arial"/>
           <w:kern w:val="0"/>
@@ -401,6 +405,7 @@
     <w:p>
       <w:pPr>
         <w:spacing w:before="100" w:beforeAutospacing="1" w:after="100" w:afterAutospacing="1" w:line="240" w:lineRule="auto"/>
+        <w:jc w:val="both"/>
         <w:rPr>
           <w:rFonts w:ascii="Arial" w:eastAsia="Times New Roman" w:hAnsi="Arial" w:cs="Arial"/>
           <w:kern w:val="0"/>
@@ -440,18 +445,8 @@
     </w:p>
     <w:p>
       <w:pPr>
-        <w:jc w:val="center"/>
-        <w:rPr>
-          <w:rFonts w:ascii="Arial" w:hAnsi="Arial" w:cs="Arial"/>
-          <w:b/>
-          <w:bCs/>
-        </w:rPr>
-      </w:pPr>
-    </w:p>
-    <w:p>
-      <w:pPr>
         <w:pStyle w:val="NormalWeb"/>
-        <w:jc w:val="center"/>
+        <w:jc w:val="both"/>
         <w:rPr>
           <w:rFonts w:ascii="Arial" w:hAnsi="Arial" w:cs="Arial"/>
           <w:b/>
@@ -474,6 +469,7 @@
     <w:p>
       <w:pPr>
         <w:pStyle w:val="NormalWeb"/>
+        <w:jc w:val="both"/>
         <w:rPr>
           <w:rFonts w:ascii="Arial" w:hAnsi="Arial" w:cs="Arial"/>
           <w:sz w:val="22"/>
@@ -496,6 +492,7 @@
           <w:ilvl w:val="0"/>
           <w:numId w:val="3"/>
         </w:numPr>
+        <w:jc w:val="both"/>
         <w:rPr>
           <w:rFonts w:ascii="Arial" w:hAnsi="Arial" w:cs="Arial"/>
           <w:sz w:val="22"/>
@@ -528,6 +525,7 @@
           <w:ilvl w:val="0"/>
           <w:numId w:val="3"/>
         </w:numPr>
+        <w:jc w:val="both"/>
         <w:rPr>
           <w:rFonts w:ascii="Arial" w:hAnsi="Arial" w:cs="Arial"/>
           <w:sz w:val="22"/>
@@ -560,6 +558,7 @@
           <w:ilvl w:val="0"/>
           <w:numId w:val="3"/>
         </w:numPr>
+        <w:jc w:val="both"/>
         <w:rPr>
           <w:rFonts w:ascii="Arial" w:hAnsi="Arial" w:cs="Arial"/>
           <w:sz w:val="22"/>
@@ -592,6 +591,7 @@
           <w:ilvl w:val="0"/>
           <w:numId w:val="3"/>
         </w:numPr>
+        <w:jc w:val="both"/>
         <w:rPr>
           <w:rFonts w:ascii="Arial" w:hAnsi="Arial" w:cs="Arial"/>
           <w:sz w:val="22"/>
@@ -624,6 +624,7 @@
           <w:ilvl w:val="0"/>
           <w:numId w:val="3"/>
         </w:numPr>
+        <w:jc w:val="both"/>
         <w:rPr>
           <w:rFonts w:ascii="Arial" w:hAnsi="Arial" w:cs="Arial"/>
           <w:sz w:val="22"/>
@@ -656,21 +657,21 @@
           <w:ilvl w:val="0"/>
           <w:numId w:val="3"/>
         </w:numPr>
-        <w:rPr>
-          <w:rFonts w:ascii="Arial" w:hAnsi="Arial" w:cs="Arial"/>
-          <w:sz w:val="22"/>
-          <w:szCs w:val="22"/>
-        </w:rPr>
-      </w:pPr>
-      <w:r>
-        <w:rPr>
-          <w:rFonts w:ascii="Arial" w:hAnsi="Arial" w:cs="Arial"/>
-          <w:b/>
-          <w:bCs/>
-          <w:sz w:val="22"/>
-          <w:szCs w:val="22"/>
-        </w:rPr>
-        <w:lastRenderedPageBreak/>
+        <w:jc w:val="both"/>
+        <w:rPr>
+          <w:rFonts w:ascii="Arial" w:hAnsi="Arial" w:cs="Arial"/>
+          <w:sz w:val="22"/>
+          <w:szCs w:val="22"/>
+        </w:rPr>
+      </w:pPr>
+      <w:r>
+        <w:rPr>
+          <w:rFonts w:ascii="Arial" w:hAnsi="Arial" w:cs="Arial"/>
+          <w:b/>
+          <w:bCs/>
+          <w:sz w:val="22"/>
+          <w:szCs w:val="22"/>
+        </w:rPr>
         <w:t>CP-13:</w:t>
       </w:r>
       <w:r>
@@ -689,6 +690,7 @@
           <w:ilvl w:val="0"/>
           <w:numId w:val="3"/>
         </w:numPr>
+        <w:jc w:val="both"/>
         <w:rPr>
           <w:rFonts w:ascii="Arial" w:hAnsi="Arial" w:cs="Arial"/>
           <w:sz w:val="22"/>
@@ -721,6 +723,7 @@
           <w:ilvl w:val="0"/>
           <w:numId w:val="3"/>
         </w:numPr>
+        <w:jc w:val="both"/>
         <w:rPr>
           <w:rFonts w:ascii="Arial" w:hAnsi="Arial" w:cs="Arial"/>
           <w:sz w:val="22"/>
@@ -753,20 +756,22 @@
           <w:ilvl w:val="0"/>
           <w:numId w:val="3"/>
         </w:numPr>
-        <w:rPr>
-          <w:rFonts w:ascii="Arial" w:hAnsi="Arial" w:cs="Arial"/>
-          <w:sz w:val="22"/>
-          <w:szCs w:val="22"/>
-        </w:rPr>
-      </w:pPr>
-      <w:r>
-        <w:rPr>
-          <w:rFonts w:ascii="Arial" w:hAnsi="Arial" w:cs="Arial"/>
-          <w:b/>
-          <w:bCs/>
-          <w:sz w:val="22"/>
-          <w:szCs w:val="22"/>
-        </w:rPr>
+        <w:jc w:val="both"/>
+        <w:rPr>
+          <w:rFonts w:ascii="Arial" w:hAnsi="Arial" w:cs="Arial"/>
+          <w:sz w:val="22"/>
+          <w:szCs w:val="22"/>
+        </w:rPr>
+      </w:pPr>
+      <w:r>
+        <w:rPr>
+          <w:rFonts w:ascii="Arial" w:hAnsi="Arial" w:cs="Arial"/>
+          <w:b/>
+          <w:bCs/>
+          <w:sz w:val="22"/>
+          <w:szCs w:val="22"/>
+        </w:rPr>
+        <w:lastRenderedPageBreak/>
         <w:t>CP-23:</w:t>
       </w:r>
       <w:r>
@@ -785,6 +790,7 @@
           <w:ilvl w:val="0"/>
           <w:numId w:val="3"/>
         </w:numPr>
+        <w:jc w:val="both"/>
         <w:rPr>
           <w:rFonts w:ascii="Arial" w:hAnsi="Arial" w:cs="Arial"/>
           <w:sz w:val="22"/>
@@ -817,6 +823,7 @@
           <w:ilvl w:val="0"/>
           <w:numId w:val="3"/>
         </w:numPr>
+        <w:jc w:val="both"/>
         <w:rPr>
           <w:rFonts w:ascii="Arial" w:hAnsi="Arial" w:cs="Arial"/>
           <w:sz w:val="22"/>
@@ -849,6 +856,7 @@
           <w:ilvl w:val="0"/>
           <w:numId w:val="3"/>
         </w:numPr>
+        <w:jc w:val="both"/>
         <w:rPr>
           <w:rFonts w:ascii="Arial" w:hAnsi="Arial" w:cs="Arial"/>
           <w:sz w:val="22"/>
@@ -881,6 +889,7 @@
           <w:ilvl w:val="0"/>
           <w:numId w:val="3"/>
         </w:numPr>
+        <w:jc w:val="both"/>
         <w:rPr>
           <w:rFonts w:ascii="Arial" w:hAnsi="Arial" w:cs="Arial"/>
           <w:sz w:val="22"/>
@@ -913,6 +922,7 @@
           <w:ilvl w:val="0"/>
           <w:numId w:val="3"/>
         </w:numPr>
+        <w:jc w:val="both"/>
         <w:rPr>
           <w:rFonts w:ascii="Arial" w:hAnsi="Arial" w:cs="Arial"/>
           <w:sz w:val="22"/>
@@ -945,6 +955,7 @@
           <w:ilvl w:val="0"/>
           <w:numId w:val="3"/>
         </w:numPr>
+        <w:jc w:val="both"/>
         <w:rPr>
           <w:rFonts w:ascii="Arial" w:hAnsi="Arial" w:cs="Arial"/>
           <w:sz w:val="22"/>
@@ -973,801 +984,747 @@
     <w:p>
       <w:pPr>
         <w:pStyle w:val="NormalWeb"/>
-        <w:rPr>
-          <w:rFonts w:ascii="Arial" w:hAnsi="Arial" w:cs="Arial"/>
-          <w:sz w:val="22"/>
-          <w:szCs w:val="22"/>
-        </w:rPr>
-      </w:pPr>
+        <w:jc w:val="both"/>
+        <w:rPr>
+          <w:rFonts w:ascii="Arial" w:hAnsi="Arial" w:cs="Arial"/>
+          <w:b/>
+          <w:bCs/>
+          <w:sz w:val="22"/>
+          <w:szCs w:val="22"/>
+        </w:rPr>
+      </w:pPr>
+      <w:r>
+        <w:rPr>
+          <w:rFonts w:ascii="Arial" w:hAnsi="Arial" w:cs="Arial"/>
+          <w:b/>
+          <w:bCs/>
+          <w:sz w:val="22"/>
+          <w:szCs w:val="22"/>
+        </w:rPr>
+        <w:t>¿QUE PRUEBAS FUERON NEGATIVAS?</w:t>
+      </w:r>
+    </w:p>
+    <w:p>
+      <w:pPr>
+        <w:spacing w:before="100" w:beforeAutospacing="1" w:after="100" w:afterAutospacing="1" w:line="240" w:lineRule="auto"/>
+        <w:jc w:val="both"/>
+        <w:rPr>
+          <w:rFonts w:ascii="Arial" w:eastAsia="Times New Roman" w:hAnsi="Arial" w:cs="Arial"/>
+          <w:kern w:val="0"/>
+          <w:lang w:eastAsia="es-CO"/>
+          <w14:ligatures w14:val="none"/>
+        </w:rPr>
+      </w:pPr>
+      <w:r>
+        <w:rPr>
+          <w:rFonts w:ascii="Arial" w:eastAsia="Times New Roman" w:hAnsi="Arial" w:cs="Arial"/>
+          <w:b/>
+          <w:bCs/>
+          <w:kern w:val="0"/>
+          <w:lang w:eastAsia="es-CO"/>
+          <w14:ligatures w14:val="none"/>
+        </w:rPr>
+        <w:t>CP-02:</w:t>
+      </w:r>
+      <w:r>
+        <w:rPr>
+          <w:rFonts w:ascii="Arial" w:eastAsia="Times New Roman" w:hAnsi="Arial" w:cs="Arial"/>
+          <w:kern w:val="0"/>
+          <w:lang w:eastAsia="es-CO"/>
+          <w14:ligatures w14:val="none"/>
+        </w:rPr>
+        <w:t xml:space="preserve"> Rechazo de registro por intento de usar un correo ya registrado. </w:t>
+      </w:r>
+    </w:p>
+    <w:p>
+      <w:pPr>
+        <w:spacing w:before="100" w:beforeAutospacing="1" w:after="100" w:afterAutospacing="1" w:line="240" w:lineRule="auto"/>
+        <w:jc w:val="both"/>
+        <w:rPr>
+          <w:rFonts w:ascii="Arial" w:eastAsia="Times New Roman" w:hAnsi="Arial" w:cs="Arial"/>
+          <w:kern w:val="0"/>
+          <w:lang w:eastAsia="es-CO"/>
+          <w14:ligatures w14:val="none"/>
+        </w:rPr>
+      </w:pPr>
+      <w:r>
+        <w:rPr>
+          <w:rFonts w:ascii="Arial" w:eastAsia="Times New Roman" w:hAnsi="Arial" w:cs="Arial"/>
+          <w:b/>
+          <w:bCs/>
+          <w:kern w:val="0"/>
+          <w:lang w:eastAsia="es-CO"/>
+          <w14:ligatures w14:val="none"/>
+        </w:rPr>
+        <w:t>CP-03:</w:t>
+      </w:r>
+      <w:r>
+        <w:rPr>
+          <w:rFonts w:ascii="Arial" w:eastAsia="Times New Roman" w:hAnsi="Arial" w:cs="Arial"/>
+          <w:kern w:val="0"/>
+          <w:lang w:eastAsia="es-CO"/>
+          <w14:ligatures w14:val="none"/>
+        </w:rPr>
+        <w:t xml:space="preserve"> Rechazo de registro al dejar campos obligatorios vacíos. </w:t>
+      </w:r>
+    </w:p>
+    <w:p>
+      <w:pPr>
+        <w:spacing w:before="100" w:beforeAutospacing="1" w:after="100" w:afterAutospacing="1" w:line="240" w:lineRule="auto"/>
+        <w:jc w:val="both"/>
+        <w:rPr>
+          <w:rFonts w:ascii="Arial" w:eastAsia="Times New Roman" w:hAnsi="Arial" w:cs="Arial"/>
+          <w:kern w:val="0"/>
+          <w:lang w:eastAsia="es-CO"/>
+          <w14:ligatures w14:val="none"/>
+        </w:rPr>
+      </w:pPr>
+      <w:r>
+        <w:rPr>
+          <w:rFonts w:ascii="Arial" w:eastAsia="Times New Roman" w:hAnsi="Arial" w:cs="Arial"/>
+          <w:b/>
+          <w:bCs/>
+          <w:kern w:val="0"/>
+          <w:lang w:eastAsia="es-CO"/>
+          <w14:ligatures w14:val="none"/>
+        </w:rPr>
+        <w:t>CP-05:</w:t>
+      </w:r>
+      <w:r>
+        <w:rPr>
+          <w:rFonts w:ascii="Arial" w:eastAsia="Times New Roman" w:hAnsi="Arial" w:cs="Arial"/>
+          <w:kern w:val="0"/>
+          <w:lang w:eastAsia="es-CO"/>
+          <w14:ligatures w14:val="none"/>
+        </w:rPr>
+        <w:t xml:space="preserve"> Rechazo de acceso por contraseña incorrecta. </w:t>
+      </w:r>
+    </w:p>
+    <w:p>
+      <w:pPr>
+        <w:spacing w:before="100" w:beforeAutospacing="1" w:after="100" w:afterAutospacing="1" w:line="240" w:lineRule="auto"/>
+        <w:jc w:val="both"/>
+        <w:rPr>
+          <w:rFonts w:ascii="Arial" w:eastAsia="Times New Roman" w:hAnsi="Arial" w:cs="Arial"/>
+          <w:kern w:val="0"/>
+          <w:lang w:eastAsia="es-CO"/>
+          <w14:ligatures w14:val="none"/>
+        </w:rPr>
+      </w:pPr>
+      <w:r>
+        <w:rPr>
+          <w:rFonts w:ascii="Arial" w:eastAsia="Times New Roman" w:hAnsi="Arial" w:cs="Arial"/>
+          <w:b/>
+          <w:bCs/>
+          <w:kern w:val="0"/>
+          <w:lang w:eastAsia="es-CO"/>
+          <w14:ligatures w14:val="none"/>
+        </w:rPr>
+        <w:t>CP-06:</w:t>
+      </w:r>
+      <w:r>
+        <w:rPr>
+          <w:rFonts w:ascii="Arial" w:eastAsia="Times New Roman" w:hAnsi="Arial" w:cs="Arial"/>
+          <w:kern w:val="0"/>
+          <w:lang w:eastAsia="es-CO"/>
+          <w14:ligatures w14:val="none"/>
+        </w:rPr>
+        <w:t xml:space="preserve"> Rechazo de acceso por usuario no registrado. </w:t>
+      </w:r>
+    </w:p>
+    <w:p>
+      <w:pPr>
+        <w:spacing w:before="100" w:beforeAutospacing="1" w:after="100" w:afterAutospacing="1" w:line="240" w:lineRule="auto"/>
+        <w:jc w:val="both"/>
+        <w:rPr>
+          <w:rFonts w:ascii="Arial" w:eastAsia="Times New Roman" w:hAnsi="Arial" w:cs="Arial"/>
+          <w:kern w:val="0"/>
+          <w:lang w:eastAsia="es-CO"/>
+          <w14:ligatures w14:val="none"/>
+        </w:rPr>
+      </w:pPr>
+      <w:r>
+        <w:rPr>
+          <w:rFonts w:ascii="Arial" w:eastAsia="Times New Roman" w:hAnsi="Arial" w:cs="Arial"/>
+          <w:b/>
+          <w:bCs/>
+          <w:kern w:val="0"/>
+          <w:lang w:eastAsia="es-CO"/>
+          <w14:ligatures w14:val="none"/>
+        </w:rPr>
+        <w:t>CP-08:</w:t>
+      </w:r>
+      <w:r>
+        <w:rPr>
+          <w:rFonts w:ascii="Arial" w:eastAsia="Times New Roman" w:hAnsi="Arial" w:cs="Arial"/>
+          <w:kern w:val="0"/>
+          <w:lang w:eastAsia="es-CO"/>
+          <w14:ligatures w14:val="none"/>
+        </w:rPr>
+        <w:t xml:space="preserve"> Notificación de error en recuperación de contraseña para cuentas no registradas. </w:t>
+      </w:r>
+    </w:p>
+    <w:p>
+      <w:pPr>
+        <w:spacing w:before="100" w:beforeAutospacing="1" w:after="100" w:afterAutospacing="1" w:line="240" w:lineRule="auto"/>
+        <w:jc w:val="both"/>
+        <w:rPr>
+          <w:rFonts w:ascii="Arial" w:eastAsia="Times New Roman" w:hAnsi="Arial" w:cs="Arial"/>
+          <w:kern w:val="0"/>
+          <w:lang w:eastAsia="es-CO"/>
+          <w14:ligatures w14:val="none"/>
+        </w:rPr>
+      </w:pPr>
+      <w:r>
+        <w:rPr>
+          <w:rFonts w:ascii="Arial" w:eastAsia="Times New Roman" w:hAnsi="Arial" w:cs="Arial"/>
+          <w:b/>
+          <w:bCs/>
+          <w:kern w:val="0"/>
+          <w:lang w:eastAsia="es-CO"/>
+          <w14:ligatures w14:val="none"/>
+        </w:rPr>
+        <w:t>CP-10:</w:t>
+      </w:r>
+      <w:r>
+        <w:rPr>
+          <w:rFonts w:ascii="Arial" w:eastAsia="Times New Roman" w:hAnsi="Arial" w:cs="Arial"/>
+          <w:kern w:val="0"/>
+          <w:lang w:eastAsia="es-CO"/>
+          <w14:ligatures w14:val="none"/>
+        </w:rPr>
+        <w:t xml:space="preserve"> Rechazo de creación de solicitud por ausencia de notas registradas. </w:t>
+      </w:r>
+    </w:p>
+    <w:p>
+      <w:pPr>
+        <w:spacing w:before="100" w:beforeAutospacing="1" w:after="100" w:afterAutospacing="1" w:line="240" w:lineRule="auto"/>
+        <w:jc w:val="both"/>
+        <w:rPr>
+          <w:rFonts w:ascii="Arial" w:eastAsia="Times New Roman" w:hAnsi="Arial" w:cs="Arial"/>
+          <w:kern w:val="0"/>
+          <w:lang w:eastAsia="es-CO"/>
+          <w14:ligatures w14:val="none"/>
+        </w:rPr>
+      </w:pPr>
+      <w:r>
+        <w:rPr>
+          <w:rFonts w:ascii="Arial" w:eastAsia="Times New Roman" w:hAnsi="Arial" w:cs="Arial"/>
+          <w:b/>
+          <w:bCs/>
+          <w:kern w:val="0"/>
+          <w:lang w:eastAsia="es-CO"/>
+          <w14:ligatures w14:val="none"/>
+        </w:rPr>
+        <w:t>CP-12:</w:t>
+      </w:r>
+      <w:r>
+        <w:rPr>
+          <w:rFonts w:ascii="Arial" w:eastAsia="Times New Roman" w:hAnsi="Arial" w:cs="Arial"/>
+          <w:kern w:val="0"/>
+          <w:lang w:eastAsia="es-CO"/>
+          <w14:ligatures w14:val="none"/>
+        </w:rPr>
+        <w:t xml:space="preserve"> Rechazo de certificado por matrícula no vigente. </w:t>
+      </w:r>
+    </w:p>
+    <w:p>
+      <w:pPr>
+        <w:spacing w:before="100" w:beforeAutospacing="1" w:after="100" w:afterAutospacing="1" w:line="240" w:lineRule="auto"/>
+        <w:jc w:val="both"/>
+        <w:rPr>
+          <w:rFonts w:ascii="Arial" w:eastAsia="Times New Roman" w:hAnsi="Arial" w:cs="Arial"/>
+          <w:kern w:val="0"/>
+          <w:lang w:eastAsia="es-CO"/>
+          <w14:ligatures w14:val="none"/>
+        </w:rPr>
+      </w:pPr>
+      <w:r>
+        <w:rPr>
+          <w:rFonts w:ascii="Arial" w:eastAsia="Times New Roman" w:hAnsi="Arial" w:cs="Arial"/>
+          <w:b/>
+          <w:bCs/>
+          <w:kern w:val="0"/>
+          <w:lang w:eastAsia="es-CO"/>
+          <w14:ligatures w14:val="none"/>
+        </w:rPr>
+        <w:t>CP-14:</w:t>
+      </w:r>
+      <w:r>
+        <w:rPr>
+          <w:rFonts w:ascii="Arial" w:eastAsia="Times New Roman" w:hAnsi="Arial" w:cs="Arial"/>
+          <w:kern w:val="0"/>
+          <w:lang w:eastAsia="es-CO"/>
+          <w14:ligatures w14:val="none"/>
+        </w:rPr>
+        <w:t xml:space="preserve"> Rechazo de registro de asignaturas por falta de matrícula financiera vigente. </w:t>
+      </w:r>
+    </w:p>
+    <w:p>
+      <w:pPr>
+        <w:spacing w:before="100" w:beforeAutospacing="1" w:after="100" w:afterAutospacing="1" w:line="240" w:lineRule="auto"/>
+        <w:jc w:val="both"/>
+        <w:rPr>
+          <w:rFonts w:ascii="Arial" w:eastAsia="Times New Roman" w:hAnsi="Arial" w:cs="Arial"/>
+          <w:kern w:val="0"/>
+          <w:lang w:eastAsia="es-CO"/>
+          <w14:ligatures w14:val="none"/>
+        </w:rPr>
+      </w:pPr>
+      <w:r>
+        <w:rPr>
+          <w:rFonts w:ascii="Arial" w:eastAsia="Times New Roman" w:hAnsi="Arial" w:cs="Arial"/>
+          <w:b/>
+          <w:bCs/>
+          <w:kern w:val="0"/>
+          <w:lang w:eastAsia="es-CO"/>
+          <w14:ligatures w14:val="none"/>
+        </w:rPr>
+        <w:t>CP-15:</w:t>
+      </w:r>
+      <w:r>
+        <w:rPr>
+          <w:rFonts w:ascii="Arial" w:eastAsia="Times New Roman" w:hAnsi="Arial" w:cs="Arial"/>
+          <w:kern w:val="0"/>
+          <w:lang w:eastAsia="es-CO"/>
+          <w14:ligatures w14:val="none"/>
+        </w:rPr>
+        <w:t xml:space="preserve"> Cancelación de asignación al detectar asignatura previamente asociada. </w:t>
+      </w:r>
+    </w:p>
+    <w:p>
+      <w:pPr>
+        <w:spacing w:before="100" w:beforeAutospacing="1" w:after="100" w:afterAutospacing="1" w:line="240" w:lineRule="auto"/>
+        <w:jc w:val="both"/>
+        <w:rPr>
+          <w:rFonts w:ascii="Arial" w:eastAsia="Times New Roman" w:hAnsi="Arial" w:cs="Arial"/>
+          <w:kern w:val="0"/>
+          <w:lang w:eastAsia="es-CO"/>
+          <w14:ligatures w14:val="none"/>
+        </w:rPr>
+      </w:pPr>
+      <w:r>
+        <w:rPr>
+          <w:rFonts w:ascii="Arial" w:eastAsia="Times New Roman" w:hAnsi="Arial" w:cs="Arial"/>
+          <w:b/>
+          <w:bCs/>
+          <w:kern w:val="0"/>
+          <w:lang w:eastAsia="es-CO"/>
+          <w14:ligatures w14:val="none"/>
+        </w:rPr>
+        <w:t>CP-16:</w:t>
+      </w:r>
+      <w:r>
+        <w:rPr>
+          <w:rFonts w:ascii="Arial" w:eastAsia="Times New Roman" w:hAnsi="Arial" w:cs="Arial"/>
+          <w:kern w:val="0"/>
+          <w:lang w:eastAsia="es-CO"/>
+          <w14:ligatures w14:val="none"/>
+        </w:rPr>
+        <w:t xml:space="preserve"> Rechazo de registro por falta de datos académicos en la institución. </w:t>
+      </w:r>
+    </w:p>
+    <w:p>
+      <w:pPr>
+        <w:spacing w:before="100" w:beforeAutospacing="1" w:after="100" w:afterAutospacing="1" w:line="240" w:lineRule="auto"/>
+        <w:jc w:val="both"/>
+        <w:rPr>
+          <w:rFonts w:ascii="Arial" w:eastAsia="Times New Roman" w:hAnsi="Arial" w:cs="Arial"/>
+          <w:kern w:val="0"/>
+          <w:lang w:eastAsia="es-CO"/>
+          <w14:ligatures w14:val="none"/>
+        </w:rPr>
+      </w:pPr>
+      <w:r>
+        <w:rPr>
+          <w:rFonts w:ascii="Arial" w:eastAsia="Times New Roman" w:hAnsi="Arial" w:cs="Arial"/>
+          <w:b/>
+          <w:bCs/>
+          <w:kern w:val="0"/>
+          <w:lang w:eastAsia="es-CO"/>
+          <w14:ligatures w14:val="none"/>
+        </w:rPr>
+        <w:t>CP-18:</w:t>
+      </w:r>
+      <w:r>
+        <w:rPr>
+          <w:rFonts w:ascii="Arial" w:eastAsia="Times New Roman" w:hAnsi="Arial" w:cs="Arial"/>
+          <w:kern w:val="0"/>
+          <w:lang w:eastAsia="es-CO"/>
+          <w14:ligatures w14:val="none"/>
+        </w:rPr>
+        <w:t xml:space="preserve"> Alerta de campos obligatorios al dejar en blanco el usuario o la contraseña. </w:t>
+      </w:r>
+    </w:p>
+    <w:p>
+      <w:pPr>
+        <w:spacing w:before="100" w:beforeAutospacing="1" w:after="100" w:afterAutospacing="1" w:line="240" w:lineRule="auto"/>
+        <w:jc w:val="both"/>
+        <w:rPr>
+          <w:rFonts w:ascii="Arial" w:eastAsia="Times New Roman" w:hAnsi="Arial" w:cs="Arial"/>
+          <w:kern w:val="0"/>
+          <w:lang w:eastAsia="es-CO"/>
+          <w14:ligatures w14:val="none"/>
+        </w:rPr>
+      </w:pPr>
+      <w:r>
+        <w:rPr>
+          <w:rFonts w:ascii="Arial" w:eastAsia="Times New Roman" w:hAnsi="Arial" w:cs="Arial"/>
+          <w:b/>
+          <w:bCs/>
+          <w:kern w:val="0"/>
+          <w:lang w:eastAsia="es-CO"/>
+          <w14:ligatures w14:val="none"/>
+        </w:rPr>
+        <w:t>CP-19:</w:t>
+      </w:r>
+      <w:r>
+        <w:rPr>
+          <w:rFonts w:ascii="Arial" w:eastAsia="Times New Roman" w:hAnsi="Arial" w:cs="Arial"/>
+          <w:kern w:val="0"/>
+          <w:lang w:eastAsia="es-CO"/>
+          <w14:ligatures w14:val="none"/>
+        </w:rPr>
+        <w:t xml:space="preserve"> Alerta por datos de usuario o contraseña incorrectos. </w:t>
+      </w:r>
+    </w:p>
+    <w:p>
+      <w:pPr>
+        <w:spacing w:before="100" w:beforeAutospacing="1" w:after="100" w:afterAutospacing="1" w:line="240" w:lineRule="auto"/>
+        <w:jc w:val="both"/>
+        <w:rPr>
+          <w:rFonts w:ascii="Arial" w:eastAsia="Times New Roman" w:hAnsi="Arial" w:cs="Arial"/>
+          <w:kern w:val="0"/>
+          <w:lang w:eastAsia="es-CO"/>
+          <w14:ligatures w14:val="none"/>
+        </w:rPr>
+      </w:pPr>
+      <w:r>
+        <w:rPr>
+          <w:rFonts w:ascii="Arial" w:eastAsia="Times New Roman" w:hAnsi="Arial" w:cs="Arial"/>
+          <w:b/>
+          <w:bCs/>
+          <w:kern w:val="0"/>
+          <w:lang w:eastAsia="es-CO"/>
+          <w14:ligatures w14:val="none"/>
+        </w:rPr>
+        <w:t>CP-20:</w:t>
+      </w:r>
+      <w:r>
+        <w:rPr>
+          <w:rFonts w:ascii="Arial" w:eastAsia="Times New Roman" w:hAnsi="Arial" w:cs="Arial"/>
+          <w:kern w:val="0"/>
+          <w:lang w:eastAsia="es-CO"/>
+          <w14:ligatures w14:val="none"/>
+        </w:rPr>
+        <w:t xml:space="preserve"> Alerta por intento de inicio de sesión de usuario no registrado. </w:t>
+      </w:r>
+    </w:p>
+    <w:p>
+      <w:pPr>
+        <w:spacing w:before="100" w:beforeAutospacing="1" w:after="100" w:afterAutospacing="1" w:line="240" w:lineRule="auto"/>
+        <w:jc w:val="both"/>
+        <w:rPr>
+          <w:rFonts w:ascii="Arial" w:eastAsia="Times New Roman" w:hAnsi="Arial" w:cs="Arial"/>
+          <w:kern w:val="0"/>
+          <w:lang w:eastAsia="es-CO"/>
+          <w14:ligatures w14:val="none"/>
+        </w:rPr>
+      </w:pPr>
+      <w:r>
+        <w:rPr>
+          <w:rFonts w:ascii="Arial" w:eastAsia="Times New Roman" w:hAnsi="Arial" w:cs="Arial"/>
+          <w:b/>
+          <w:bCs/>
+          <w:kern w:val="0"/>
+          <w:lang w:eastAsia="es-CO"/>
+          <w14:ligatures w14:val="none"/>
+        </w:rPr>
+        <w:t>CP-22:</w:t>
+      </w:r>
+      <w:r>
+        <w:rPr>
+          <w:rFonts w:ascii="Arial" w:eastAsia="Times New Roman" w:hAnsi="Arial" w:cs="Arial"/>
+          <w:kern w:val="0"/>
+          <w:lang w:eastAsia="es-CO"/>
+          <w14:ligatures w14:val="none"/>
+        </w:rPr>
+        <w:t xml:space="preserve"> Rechazo de acceso cuando la cuenta no corresponde al rol seleccionado. </w:t>
+      </w:r>
+    </w:p>
+    <w:p>
+      <w:pPr>
+        <w:spacing w:before="100" w:beforeAutospacing="1" w:after="100" w:afterAutospacing="1" w:line="240" w:lineRule="auto"/>
+        <w:jc w:val="both"/>
+        <w:rPr>
+          <w:rFonts w:ascii="Arial" w:eastAsia="Times New Roman" w:hAnsi="Arial" w:cs="Arial"/>
+          <w:kern w:val="0"/>
+          <w:lang w:eastAsia="es-CO"/>
+          <w14:ligatures w14:val="none"/>
+        </w:rPr>
+      </w:pPr>
+      <w:r>
+        <w:rPr>
+          <w:rFonts w:ascii="Arial" w:eastAsia="Times New Roman" w:hAnsi="Arial" w:cs="Arial"/>
+          <w:b/>
+          <w:bCs/>
+          <w:kern w:val="0"/>
+          <w:lang w:eastAsia="es-CO"/>
+          <w14:ligatures w14:val="none"/>
+        </w:rPr>
+        <w:t>CP-25:</w:t>
+      </w:r>
+      <w:r>
+        <w:rPr>
+          <w:rFonts w:ascii="Arial" w:eastAsia="Times New Roman" w:hAnsi="Arial" w:cs="Arial"/>
+          <w:kern w:val="0"/>
+          <w:lang w:eastAsia="es-CO"/>
+          <w14:ligatures w14:val="none"/>
+        </w:rPr>
+        <w:t xml:space="preserve"> Rechazo de solicitud al enviar el formulario con campos obligatorios vacíos. </w:t>
+      </w:r>
+    </w:p>
+    <w:p>
+      <w:pPr>
+        <w:spacing w:before="100" w:beforeAutospacing="1" w:after="100" w:afterAutospacing="1" w:line="240" w:lineRule="auto"/>
+        <w:jc w:val="both"/>
+        <w:rPr>
+          <w:rFonts w:ascii="Arial" w:eastAsia="Times New Roman" w:hAnsi="Arial" w:cs="Arial"/>
+          <w:kern w:val="0"/>
+          <w:lang w:eastAsia="es-CO"/>
+          <w14:ligatures w14:val="none"/>
+        </w:rPr>
+      </w:pPr>
+      <w:r>
+        <w:rPr>
+          <w:rFonts w:ascii="Arial" w:eastAsia="Times New Roman" w:hAnsi="Arial" w:cs="Arial"/>
+          <w:b/>
+          <w:bCs/>
+          <w:kern w:val="0"/>
+          <w:lang w:eastAsia="es-CO"/>
+          <w14:ligatures w14:val="none"/>
+        </w:rPr>
+        <w:t>CP-31:</w:t>
+      </w:r>
+      <w:r>
+        <w:rPr>
+          <w:rFonts w:ascii="Arial" w:eastAsia="Times New Roman" w:hAnsi="Arial" w:cs="Arial"/>
+          <w:kern w:val="0"/>
+          <w:lang w:eastAsia="es-CO"/>
+          <w14:ligatures w14:val="none"/>
+        </w:rPr>
+        <w:t xml:space="preserve"> Notificación de "no encontrado" al ingresar un número identificador inexistente o inválido</w:t>
+      </w:r>
     </w:p>
     <w:p>
       <w:pPr>
         <w:pStyle w:val="NormalWeb"/>
-        <w:jc w:val="center"/>
-        <w:rPr>
-          <w:rFonts w:ascii="Arial" w:hAnsi="Arial" w:cs="Arial"/>
-          <w:b/>
-          <w:bCs/>
-          <w:sz w:val="22"/>
-          <w:szCs w:val="22"/>
-        </w:rPr>
-      </w:pPr>
-      <w:r>
-        <w:rPr>
-          <w:rFonts w:ascii="Arial" w:hAnsi="Arial" w:cs="Arial"/>
-          <w:b/>
-          <w:bCs/>
-          <w:sz w:val="22"/>
-          <w:szCs w:val="22"/>
-        </w:rPr>
-        <w:t>¿QUE PRUEBAS FUERON</w:t>
-      </w:r>
-      <w:r>
-        <w:rPr>
-          <w:rFonts w:ascii="Arial" w:hAnsi="Arial" w:cs="Arial"/>
-          <w:b/>
-          <w:bCs/>
-          <w:sz w:val="22"/>
-          <w:szCs w:val="22"/>
-        </w:rPr>
-        <w:t xml:space="preserve"> NEGATIVAS</w:t>
-      </w:r>
-      <w:r>
-        <w:rPr>
-          <w:rFonts w:ascii="Arial" w:hAnsi="Arial" w:cs="Arial"/>
-          <w:b/>
-          <w:bCs/>
-          <w:sz w:val="22"/>
-          <w:szCs w:val="22"/>
-        </w:rPr>
-        <w:t>?</w:t>
+        <w:jc w:val="both"/>
+        <w:rPr>
+          <w:rFonts w:ascii="Arial" w:hAnsi="Arial" w:cs="Arial"/>
+          <w:b/>
+          <w:bCs/>
+          <w:sz w:val="22"/>
+          <w:szCs w:val="22"/>
+        </w:rPr>
+      </w:pPr>
+      <w:r>
+        <w:rPr>
+          <w:rFonts w:ascii="Arial" w:hAnsi="Arial" w:cs="Arial"/>
+          <w:b/>
+          <w:bCs/>
+          <w:sz w:val="22"/>
+          <w:szCs w:val="22"/>
+        </w:rPr>
+        <w:t>¿QUE CAMBIOS DEBERIA REALIZAR</w:t>
+      </w:r>
+      <w:r>
+        <w:rPr>
+          <w:rFonts w:ascii="Arial" w:hAnsi="Arial" w:cs="Arial"/>
+          <w:b/>
+          <w:bCs/>
+          <w:sz w:val="22"/>
+          <w:szCs w:val="22"/>
+        </w:rPr>
+        <w:t>SE</w:t>
+      </w:r>
+      <w:r>
+        <w:rPr>
+          <w:rFonts w:ascii="Arial" w:hAnsi="Arial" w:cs="Arial"/>
+          <w:b/>
+          <w:bCs/>
+          <w:sz w:val="22"/>
+          <w:szCs w:val="22"/>
+        </w:rPr>
+        <w:t xml:space="preserve"> EL SOFTWARE?</w:t>
       </w:r>
     </w:p>
     <w:p>
       <w:pPr>
         <w:spacing w:before="100" w:beforeAutospacing="1" w:after="100" w:afterAutospacing="1" w:line="240" w:lineRule="auto"/>
-        <w:rPr>
-          <w:rFonts w:ascii="Arial" w:eastAsia="Times New Roman" w:hAnsi="Arial" w:cs="Arial"/>
-          <w:kern w:val="0"/>
-          <w:lang w:eastAsia="es-CO"/>
-          <w14:ligatures w14:val="none"/>
-        </w:rPr>
-      </w:pPr>
-      <w:r>
-        <w:rPr>
-          <w:rFonts w:ascii="Arial" w:eastAsia="Times New Roman" w:hAnsi="Arial" w:cs="Arial"/>
-          <w:b/>
-          <w:bCs/>
-          <w:kern w:val="0"/>
-          <w:lang w:eastAsia="es-CO"/>
-          <w14:ligatures w14:val="none"/>
-        </w:rPr>
-        <w:t>CP-02:</w:t>
-      </w:r>
-      <w:r>
-        <w:rPr>
-          <w:rFonts w:ascii="Arial" w:eastAsia="Times New Roman" w:hAnsi="Arial" w:cs="Arial"/>
-          <w:kern w:val="0"/>
-          <w:lang w:eastAsia="es-CO"/>
-          <w14:ligatures w14:val="none"/>
-        </w:rPr>
-        <w:t xml:space="preserve"> Rechazo de registro por intento de usar un correo ya registrado. </w:t>
+        <w:jc w:val="both"/>
+        <w:rPr>
+          <w:rFonts w:ascii="Arial" w:eastAsia="Times New Roman" w:hAnsi="Arial" w:cs="Arial"/>
+          <w:kern w:val="0"/>
+          <w:lang w:eastAsia="es-CO"/>
+          <w14:ligatures w14:val="none"/>
+        </w:rPr>
+      </w:pPr>
+      <w:r>
+        <w:rPr>
+          <w:rFonts w:ascii="Arial" w:eastAsia="Times New Roman" w:hAnsi="Arial" w:cs="Arial"/>
+          <w:b/>
+          <w:bCs/>
+          <w:kern w:val="0"/>
+          <w:lang w:eastAsia="es-CO"/>
+          <w14:ligatures w14:val="none"/>
+        </w:rPr>
+        <w:lastRenderedPageBreak/>
+        <w:t>Normalización de la numeración de requerimientos:</w:t>
+      </w:r>
+      <w:r>
+        <w:rPr>
+          <w:rFonts w:ascii="Arial" w:eastAsia="Times New Roman" w:hAnsi="Arial" w:cs="Arial"/>
+          <w:kern w:val="0"/>
+          <w:lang w:eastAsia="es-CO"/>
+          <w14:ligatures w14:val="none"/>
+        </w:rPr>
+        <w:t xml:space="preserve"> Corregir el desfasaje en los identificadores entre el documento de Requisitos y los Casos de Pruebas (por ejemplo, alinear el RF-04/RF-18, RF-05/RF-19, RF-06/RF-20 y RF-07/RF-21). </w:t>
       </w:r>
     </w:p>
     <w:p>
       <w:pPr>
         <w:spacing w:before="100" w:beforeAutospacing="1" w:after="100" w:afterAutospacing="1" w:line="240" w:lineRule="auto"/>
-        <w:rPr>
-          <w:rFonts w:ascii="Arial" w:eastAsia="Times New Roman" w:hAnsi="Arial" w:cs="Arial"/>
-          <w:kern w:val="0"/>
-          <w:lang w:eastAsia="es-CO"/>
-          <w14:ligatures w14:val="none"/>
-        </w:rPr>
-      </w:pPr>
-      <w:r>
-        <w:rPr>
-          <w:rFonts w:ascii="Arial" w:eastAsia="Times New Roman" w:hAnsi="Arial" w:cs="Arial"/>
-          <w:b/>
-          <w:bCs/>
-          <w:kern w:val="0"/>
-          <w:lang w:eastAsia="es-CO"/>
-          <w14:ligatures w14:val="none"/>
-        </w:rPr>
-        <w:t>CP-03:</w:t>
-      </w:r>
-      <w:r>
-        <w:rPr>
-          <w:rFonts w:ascii="Arial" w:eastAsia="Times New Roman" w:hAnsi="Arial" w:cs="Arial"/>
-          <w:kern w:val="0"/>
-          <w:lang w:eastAsia="es-CO"/>
-          <w14:ligatures w14:val="none"/>
-        </w:rPr>
-        <w:t xml:space="preserve"> Rechazo de registro al dejar campos obligatorios vacíos. </w:t>
+        <w:jc w:val="both"/>
+        <w:rPr>
+          <w:rFonts w:ascii="Arial" w:eastAsia="Times New Roman" w:hAnsi="Arial" w:cs="Arial"/>
+          <w:kern w:val="0"/>
+          <w:lang w:eastAsia="es-CO"/>
+          <w14:ligatures w14:val="none"/>
+        </w:rPr>
+      </w:pPr>
+      <w:r>
+        <w:rPr>
+          <w:rFonts w:ascii="Arial" w:eastAsia="Times New Roman" w:hAnsi="Arial" w:cs="Arial"/>
+          <w:b/>
+          <w:bCs/>
+          <w:kern w:val="0"/>
+          <w:lang w:eastAsia="es-CO"/>
+          <w14:ligatures w14:val="none"/>
+        </w:rPr>
+        <w:t>Desarrollo del módulo de filtrado:</w:t>
+      </w:r>
+      <w:r>
+        <w:rPr>
+          <w:rFonts w:ascii="Arial" w:eastAsia="Times New Roman" w:hAnsi="Arial" w:cs="Arial"/>
+          <w:kern w:val="0"/>
+          <w:lang w:eastAsia="es-CO"/>
+          <w14:ligatures w14:val="none"/>
+        </w:rPr>
+        <w:t xml:space="preserve"> Diseñar e incorporar las pruebas y componentes necesarios para cumplir con la funcionalidad de filtrado de solicitudes por estado para los funcionarios (RF-08). </w:t>
       </w:r>
     </w:p>
     <w:p>
       <w:pPr>
         <w:spacing w:before="100" w:beforeAutospacing="1" w:after="100" w:afterAutospacing="1" w:line="240" w:lineRule="auto"/>
-        <w:rPr>
-          <w:rFonts w:ascii="Arial" w:eastAsia="Times New Roman" w:hAnsi="Arial" w:cs="Arial"/>
-          <w:kern w:val="0"/>
-          <w:lang w:eastAsia="es-CO"/>
-          <w14:ligatures w14:val="none"/>
-        </w:rPr>
-      </w:pPr>
-      <w:r>
-        <w:rPr>
-          <w:rFonts w:ascii="Arial" w:eastAsia="Times New Roman" w:hAnsi="Arial" w:cs="Arial"/>
-          <w:b/>
-          <w:bCs/>
-          <w:kern w:val="0"/>
-          <w:lang w:eastAsia="es-CO"/>
-          <w14:ligatures w14:val="none"/>
-        </w:rPr>
-        <w:t>CP-05:</w:t>
-      </w:r>
-      <w:r>
-        <w:rPr>
-          <w:rFonts w:ascii="Arial" w:eastAsia="Times New Roman" w:hAnsi="Arial" w:cs="Arial"/>
-          <w:kern w:val="0"/>
-          <w:lang w:eastAsia="es-CO"/>
-          <w14:ligatures w14:val="none"/>
-        </w:rPr>
-        <w:t xml:space="preserve"> Rechazo de acceso por contraseña incorrecta. </w:t>
+        <w:jc w:val="both"/>
+        <w:rPr>
+          <w:rFonts w:ascii="Arial" w:eastAsia="Times New Roman" w:hAnsi="Arial" w:cs="Arial"/>
+          <w:kern w:val="0"/>
+          <w:lang w:eastAsia="es-CO"/>
+          <w14:ligatures w14:val="none"/>
+        </w:rPr>
+      </w:pPr>
+      <w:r>
+        <w:rPr>
+          <w:rFonts w:ascii="Arial" w:eastAsia="Times New Roman" w:hAnsi="Arial" w:cs="Arial"/>
+          <w:b/>
+          <w:bCs/>
+          <w:kern w:val="0"/>
+          <w:lang w:eastAsia="es-CO"/>
+          <w14:ligatures w14:val="none"/>
+        </w:rPr>
+        <w:t>Ajuste de validaciones en casos de prueba:</w:t>
+      </w:r>
+      <w:r>
+        <w:rPr>
+          <w:rFonts w:ascii="Arial" w:eastAsia="Times New Roman" w:hAnsi="Arial" w:cs="Arial"/>
+          <w:kern w:val="0"/>
+          <w:lang w:eastAsia="es-CO"/>
+          <w14:ligatures w14:val="none"/>
+        </w:rPr>
+        <w:t xml:space="preserve"> Corregir duplicidades observadas en la redacción de entradas/resultados en casos de prueba como el CP-31. </w:t>
+      </w:r>
+    </w:p>
+    <w:p>
+      <w:pPr>
+        <w:pStyle w:val="NormalWeb"/>
+        <w:jc w:val="both"/>
+        <w:rPr>
+          <w:rFonts w:ascii="Arial" w:hAnsi="Arial" w:cs="Arial"/>
+          <w:b/>
+          <w:bCs/>
+          <w:sz w:val="22"/>
+          <w:szCs w:val="22"/>
+        </w:rPr>
+      </w:pPr>
+      <w:r>
+        <w:rPr>
+          <w:rFonts w:ascii="Arial" w:hAnsi="Arial" w:cs="Arial"/>
+          <w:b/>
+          <w:bCs/>
+          <w:sz w:val="22"/>
+          <w:szCs w:val="22"/>
+        </w:rPr>
+        <w:t>¿</w:t>
+      </w:r>
+      <w:r>
+        <w:rPr>
+          <w:rFonts w:ascii="Arial" w:hAnsi="Arial" w:cs="Arial"/>
+          <w:b/>
+          <w:bCs/>
+          <w:sz w:val="22"/>
+          <w:szCs w:val="22"/>
+        </w:rPr>
+        <w:t>CÓMO DEMOSTRARÍAN ANTE LA ORGANIZACIÓN QUE LA SOLUCIÓN CUMPLE LOS REQUERIMIENTOS?</w:t>
       </w:r>
     </w:p>
     <w:p>
       <w:pPr>
         <w:spacing w:before="100" w:beforeAutospacing="1" w:after="100" w:afterAutospacing="1" w:line="240" w:lineRule="auto"/>
-        <w:rPr>
-          <w:rFonts w:ascii="Arial" w:eastAsia="Times New Roman" w:hAnsi="Arial" w:cs="Arial"/>
-          <w:kern w:val="0"/>
-          <w:lang w:eastAsia="es-CO"/>
-          <w14:ligatures w14:val="none"/>
-        </w:rPr>
-      </w:pPr>
-      <w:r>
-        <w:rPr>
-          <w:rFonts w:ascii="Arial" w:eastAsia="Times New Roman" w:hAnsi="Arial" w:cs="Arial"/>
-          <w:b/>
-          <w:bCs/>
-          <w:kern w:val="0"/>
-          <w:lang w:eastAsia="es-CO"/>
-          <w14:ligatures w14:val="none"/>
-        </w:rPr>
-        <w:t>CP-06:</w:t>
-      </w:r>
-      <w:r>
-        <w:rPr>
-          <w:rFonts w:ascii="Arial" w:eastAsia="Times New Roman" w:hAnsi="Arial" w:cs="Arial"/>
-          <w:kern w:val="0"/>
-          <w:lang w:eastAsia="es-CO"/>
-          <w14:ligatures w14:val="none"/>
-        </w:rPr>
-        <w:t xml:space="preserve"> Rechazo de acceso por usuario no registrado. </w:t>
+        <w:jc w:val="both"/>
+        <w:rPr>
+          <w:rFonts w:ascii="Arial" w:eastAsia="Times New Roman" w:hAnsi="Arial" w:cs="Arial"/>
+          <w:kern w:val="0"/>
+          <w:lang w:eastAsia="es-CO"/>
+          <w14:ligatures w14:val="none"/>
+        </w:rPr>
+      </w:pPr>
+      <w:r>
+        <w:rPr>
+          <w:rFonts w:ascii="Arial" w:eastAsia="Times New Roman" w:hAnsi="Arial" w:cs="Arial"/>
+          <w:b/>
+          <w:bCs/>
+          <w:kern w:val="0"/>
+          <w:lang w:eastAsia="es-CO"/>
+          <w14:ligatures w14:val="none"/>
+        </w:rPr>
+        <w:t>Matriz de Trazabilidad:</w:t>
+      </w:r>
+      <w:r>
+        <w:rPr>
+          <w:rFonts w:ascii="Arial" w:eastAsia="Times New Roman" w:hAnsi="Arial" w:cs="Arial"/>
+          <w:kern w:val="0"/>
+          <w:lang w:eastAsia="es-CO"/>
+          <w14:ligatures w14:val="none"/>
+        </w:rPr>
+        <w:t xml:space="preserve"> Presentando el cruce entre los Requisitos Funcionales (RF-01 al RF-07/RF-15 a RF-21) y los Casos de Prueba mapeados (CP-01 al CP-31). </w:t>
       </w:r>
     </w:p>
     <w:p>
       <w:pPr>
         <w:spacing w:before="100" w:beforeAutospacing="1" w:after="100" w:afterAutospacing="1" w:line="240" w:lineRule="auto"/>
-        <w:rPr>
-          <w:rFonts w:ascii="Arial" w:eastAsia="Times New Roman" w:hAnsi="Arial" w:cs="Arial"/>
-          <w:kern w:val="0"/>
-          <w:lang w:eastAsia="es-CO"/>
-          <w14:ligatures w14:val="none"/>
-        </w:rPr>
-      </w:pPr>
-      <w:r>
-        <w:rPr>
-          <w:rFonts w:ascii="Arial" w:eastAsia="Times New Roman" w:hAnsi="Arial" w:cs="Arial"/>
-          <w:b/>
-          <w:bCs/>
-          <w:kern w:val="0"/>
-          <w:lang w:eastAsia="es-CO"/>
-          <w14:ligatures w14:val="none"/>
-        </w:rPr>
-        <w:t>CP-08:</w:t>
-      </w:r>
-      <w:r>
-        <w:rPr>
-          <w:rFonts w:ascii="Arial" w:eastAsia="Times New Roman" w:hAnsi="Arial" w:cs="Arial"/>
-          <w:kern w:val="0"/>
-          <w:lang w:eastAsia="es-CO"/>
-          <w14:ligatures w14:val="none"/>
-        </w:rPr>
-        <w:t xml:space="preserve"> Notificación de error en recuperación de contraseña para cuentas no registradas. </w:t>
-      </w:r>
-    </w:p>
-    <w:p>
-      <w:pPr>
-        <w:spacing w:before="100" w:beforeAutospacing="1" w:after="100" w:afterAutospacing="1" w:line="240" w:lineRule="auto"/>
-        <w:rPr>
-          <w:rFonts w:ascii="Arial" w:eastAsia="Times New Roman" w:hAnsi="Arial" w:cs="Arial"/>
-          <w:kern w:val="0"/>
-          <w:lang w:eastAsia="es-CO"/>
-          <w14:ligatures w14:val="none"/>
-        </w:rPr>
-      </w:pPr>
-      <w:r>
-        <w:rPr>
-          <w:rFonts w:ascii="Arial" w:eastAsia="Times New Roman" w:hAnsi="Arial" w:cs="Arial"/>
-          <w:b/>
-          <w:bCs/>
-          <w:kern w:val="0"/>
-          <w:lang w:eastAsia="es-CO"/>
-          <w14:ligatures w14:val="none"/>
-        </w:rPr>
-        <w:t>CP-10:</w:t>
-      </w:r>
-      <w:r>
-        <w:rPr>
-          <w:rFonts w:ascii="Arial" w:eastAsia="Times New Roman" w:hAnsi="Arial" w:cs="Arial"/>
-          <w:kern w:val="0"/>
-          <w:lang w:eastAsia="es-CO"/>
-          <w14:ligatures w14:val="none"/>
-        </w:rPr>
-        <w:t xml:space="preserve"> Rechazo de creación de solicitud por ausencia de notas registradas. </w:t>
-      </w:r>
-    </w:p>
-    <w:p>
-      <w:pPr>
-        <w:spacing w:before="100" w:beforeAutospacing="1" w:after="100" w:afterAutospacing="1" w:line="240" w:lineRule="auto"/>
-        <w:rPr>
-          <w:rFonts w:ascii="Arial" w:eastAsia="Times New Roman" w:hAnsi="Arial" w:cs="Arial"/>
-          <w:kern w:val="0"/>
-          <w:lang w:eastAsia="es-CO"/>
-          <w14:ligatures w14:val="none"/>
-        </w:rPr>
-      </w:pPr>
-      <w:r>
-        <w:rPr>
-          <w:rFonts w:ascii="Arial" w:eastAsia="Times New Roman" w:hAnsi="Arial" w:cs="Arial"/>
-          <w:b/>
-          <w:bCs/>
-          <w:kern w:val="0"/>
-          <w:lang w:eastAsia="es-CO"/>
-          <w14:ligatures w14:val="none"/>
-        </w:rPr>
-        <w:t>CP-12:</w:t>
-      </w:r>
-      <w:r>
-        <w:rPr>
-          <w:rFonts w:ascii="Arial" w:eastAsia="Times New Roman" w:hAnsi="Arial" w:cs="Arial"/>
-          <w:kern w:val="0"/>
-          <w:lang w:eastAsia="es-CO"/>
-          <w14:ligatures w14:val="none"/>
-        </w:rPr>
-        <w:t xml:space="preserve"> Rechazo de certificado por matrícula no vigente. </w:t>
-      </w:r>
-    </w:p>
-    <w:p>
-      <w:pPr>
-        <w:spacing w:before="100" w:beforeAutospacing="1" w:after="100" w:afterAutospacing="1" w:line="240" w:lineRule="auto"/>
-        <w:rPr>
-          <w:rFonts w:ascii="Arial" w:eastAsia="Times New Roman" w:hAnsi="Arial" w:cs="Arial"/>
-          <w:kern w:val="0"/>
-          <w:lang w:eastAsia="es-CO"/>
-          <w14:ligatures w14:val="none"/>
-        </w:rPr>
-      </w:pPr>
-      <w:r>
-        <w:rPr>
-          <w:rFonts w:ascii="Arial" w:eastAsia="Times New Roman" w:hAnsi="Arial" w:cs="Arial"/>
-          <w:b/>
-          <w:bCs/>
-          <w:kern w:val="0"/>
-          <w:lang w:eastAsia="es-CO"/>
-          <w14:ligatures w14:val="none"/>
-        </w:rPr>
-        <w:t>CP-14:</w:t>
-      </w:r>
-      <w:r>
-        <w:rPr>
-          <w:rFonts w:ascii="Arial" w:eastAsia="Times New Roman" w:hAnsi="Arial" w:cs="Arial"/>
-          <w:kern w:val="0"/>
-          <w:lang w:eastAsia="es-CO"/>
-          <w14:ligatures w14:val="none"/>
-        </w:rPr>
-        <w:t xml:space="preserve"> Rechazo de registro de asignaturas por falta de matrícula financiera vigente. </w:t>
-      </w:r>
-    </w:p>
-    <w:p>
-      <w:pPr>
-        <w:spacing w:before="100" w:beforeAutospacing="1" w:after="100" w:afterAutospacing="1" w:line="240" w:lineRule="auto"/>
-        <w:rPr>
-          <w:rFonts w:ascii="Arial" w:eastAsia="Times New Roman" w:hAnsi="Arial" w:cs="Arial"/>
-          <w:kern w:val="0"/>
-          <w:lang w:eastAsia="es-CO"/>
-          <w14:ligatures w14:val="none"/>
-        </w:rPr>
-      </w:pPr>
-      <w:r>
-        <w:rPr>
-          <w:rFonts w:ascii="Arial" w:eastAsia="Times New Roman" w:hAnsi="Arial" w:cs="Arial"/>
-          <w:b/>
-          <w:bCs/>
-          <w:kern w:val="0"/>
-          <w:lang w:eastAsia="es-CO"/>
-          <w14:ligatures w14:val="none"/>
-        </w:rPr>
-        <w:t>CP-15:</w:t>
-      </w:r>
-      <w:r>
-        <w:rPr>
-          <w:rFonts w:ascii="Arial" w:eastAsia="Times New Roman" w:hAnsi="Arial" w:cs="Arial"/>
-          <w:kern w:val="0"/>
-          <w:lang w:eastAsia="es-CO"/>
-          <w14:ligatures w14:val="none"/>
-        </w:rPr>
-        <w:t xml:space="preserve"> Cancelación de asignación al detectar asignatura previamente asociada. </w:t>
-      </w:r>
-    </w:p>
-    <w:p>
-      <w:pPr>
-        <w:spacing w:before="100" w:beforeAutospacing="1" w:after="100" w:afterAutospacing="1" w:line="240" w:lineRule="auto"/>
-        <w:rPr>
-          <w:rFonts w:ascii="Arial" w:eastAsia="Times New Roman" w:hAnsi="Arial" w:cs="Arial"/>
-          <w:kern w:val="0"/>
-          <w:lang w:eastAsia="es-CO"/>
-          <w14:ligatures w14:val="none"/>
-        </w:rPr>
-      </w:pPr>
-      <w:r>
-        <w:rPr>
-          <w:rFonts w:ascii="Arial" w:eastAsia="Times New Roman" w:hAnsi="Arial" w:cs="Arial"/>
-          <w:b/>
-          <w:bCs/>
-          <w:kern w:val="0"/>
-          <w:lang w:eastAsia="es-CO"/>
-          <w14:ligatures w14:val="none"/>
-        </w:rPr>
-        <w:t>CP-16:</w:t>
-      </w:r>
-      <w:r>
-        <w:rPr>
-          <w:rFonts w:ascii="Arial" w:eastAsia="Times New Roman" w:hAnsi="Arial" w:cs="Arial"/>
-          <w:kern w:val="0"/>
-          <w:lang w:eastAsia="es-CO"/>
-          <w14:ligatures w14:val="none"/>
-        </w:rPr>
-        <w:t xml:space="preserve"> Rechazo de registro por falta de datos académicos en la institución. </w:t>
-      </w:r>
-    </w:p>
-    <w:p>
-      <w:pPr>
-        <w:spacing w:before="100" w:beforeAutospacing="1" w:after="100" w:afterAutospacing="1" w:line="240" w:lineRule="auto"/>
-        <w:rPr>
-          <w:rFonts w:ascii="Arial" w:eastAsia="Times New Roman" w:hAnsi="Arial" w:cs="Arial"/>
-          <w:kern w:val="0"/>
-          <w:lang w:eastAsia="es-CO"/>
-          <w14:ligatures w14:val="none"/>
-        </w:rPr>
-      </w:pPr>
-      <w:r>
-        <w:rPr>
-          <w:rFonts w:ascii="Arial" w:eastAsia="Times New Roman" w:hAnsi="Arial" w:cs="Arial"/>
-          <w:b/>
-          <w:bCs/>
-          <w:kern w:val="0"/>
-          <w:lang w:eastAsia="es-CO"/>
-          <w14:ligatures w14:val="none"/>
-        </w:rPr>
-        <w:t>CP-18:</w:t>
-      </w:r>
-      <w:r>
-        <w:rPr>
-          <w:rFonts w:ascii="Arial" w:eastAsia="Times New Roman" w:hAnsi="Arial" w:cs="Arial"/>
-          <w:kern w:val="0"/>
-          <w:lang w:eastAsia="es-CO"/>
-          <w14:ligatures w14:val="none"/>
-        </w:rPr>
-        <w:t xml:space="preserve"> Alerta de campos obligatorios al dejar en blanco el usuario o la contraseña. </w:t>
-      </w:r>
-    </w:p>
-    <w:p>
-      <w:pPr>
-        <w:spacing w:before="100" w:beforeAutospacing="1" w:after="100" w:afterAutospacing="1" w:line="240" w:lineRule="auto"/>
-        <w:rPr>
-          <w:rFonts w:ascii="Arial" w:eastAsia="Times New Roman" w:hAnsi="Arial" w:cs="Arial"/>
-          <w:kern w:val="0"/>
-          <w:lang w:eastAsia="es-CO"/>
-          <w14:ligatures w14:val="none"/>
-        </w:rPr>
-      </w:pPr>
-      <w:r>
-        <w:rPr>
-          <w:rFonts w:ascii="Arial" w:eastAsia="Times New Roman" w:hAnsi="Arial" w:cs="Arial"/>
-          <w:b/>
-          <w:bCs/>
-          <w:kern w:val="0"/>
-          <w:lang w:eastAsia="es-CO"/>
-          <w14:ligatures w14:val="none"/>
-        </w:rPr>
-        <w:t>CP-19:</w:t>
-      </w:r>
-      <w:r>
-        <w:rPr>
-          <w:rFonts w:ascii="Arial" w:eastAsia="Times New Roman" w:hAnsi="Arial" w:cs="Arial"/>
-          <w:kern w:val="0"/>
-          <w:lang w:eastAsia="es-CO"/>
-          <w14:ligatures w14:val="none"/>
-        </w:rPr>
-        <w:t xml:space="preserve"> Alerta por datos de usuario o contraseña incorrectos. </w:t>
-      </w:r>
-    </w:p>
-    <w:p>
-      <w:pPr>
-        <w:spacing w:before="100" w:beforeAutospacing="1" w:after="100" w:afterAutospacing="1" w:line="240" w:lineRule="auto"/>
-        <w:rPr>
-          <w:rFonts w:ascii="Arial" w:eastAsia="Times New Roman" w:hAnsi="Arial" w:cs="Arial"/>
-          <w:kern w:val="0"/>
-          <w:lang w:eastAsia="es-CO"/>
-          <w14:ligatures w14:val="none"/>
-        </w:rPr>
-      </w:pPr>
-      <w:r>
-        <w:rPr>
-          <w:rFonts w:ascii="Arial" w:eastAsia="Times New Roman" w:hAnsi="Arial" w:cs="Arial"/>
-          <w:b/>
-          <w:bCs/>
-          <w:kern w:val="0"/>
-          <w:lang w:eastAsia="es-CO"/>
-          <w14:ligatures w14:val="none"/>
-        </w:rPr>
-        <w:t>CP-20:</w:t>
-      </w:r>
-      <w:r>
-        <w:rPr>
-          <w:rFonts w:ascii="Arial" w:eastAsia="Times New Roman" w:hAnsi="Arial" w:cs="Arial"/>
-          <w:kern w:val="0"/>
-          <w:lang w:eastAsia="es-CO"/>
-          <w14:ligatures w14:val="none"/>
-        </w:rPr>
-        <w:t xml:space="preserve"> Alerta por intento de inicio de sesión de usuario no registrado. </w:t>
-      </w:r>
-    </w:p>
-    <w:p>
-      <w:pPr>
-        <w:spacing w:before="100" w:beforeAutospacing="1" w:after="100" w:afterAutospacing="1" w:line="240" w:lineRule="auto"/>
-        <w:rPr>
-          <w:rFonts w:ascii="Arial" w:eastAsia="Times New Roman" w:hAnsi="Arial" w:cs="Arial"/>
-          <w:kern w:val="0"/>
-          <w:lang w:eastAsia="es-CO"/>
-          <w14:ligatures w14:val="none"/>
-        </w:rPr>
-      </w:pPr>
-      <w:r>
-        <w:rPr>
-          <w:rFonts w:ascii="Arial" w:eastAsia="Times New Roman" w:hAnsi="Arial" w:cs="Arial"/>
-          <w:b/>
-          <w:bCs/>
-          <w:kern w:val="0"/>
-          <w:lang w:eastAsia="es-CO"/>
-          <w14:ligatures w14:val="none"/>
-        </w:rPr>
-        <w:t>CP-22:</w:t>
-      </w:r>
-      <w:r>
-        <w:rPr>
-          <w:rFonts w:ascii="Arial" w:eastAsia="Times New Roman" w:hAnsi="Arial" w:cs="Arial"/>
-          <w:kern w:val="0"/>
-          <w:lang w:eastAsia="es-CO"/>
-          <w14:ligatures w14:val="none"/>
-        </w:rPr>
-        <w:t xml:space="preserve"> Rechazo de acceso cuando la cuenta no corresponde al rol seleccionado. </w:t>
-      </w:r>
-    </w:p>
-    <w:p>
-      <w:pPr>
-        <w:spacing w:before="100" w:beforeAutospacing="1" w:after="100" w:afterAutospacing="1" w:line="240" w:lineRule="auto"/>
-        <w:rPr>
-          <w:rFonts w:ascii="Arial" w:eastAsia="Times New Roman" w:hAnsi="Arial" w:cs="Arial"/>
-          <w:kern w:val="0"/>
-          <w:lang w:eastAsia="es-CO"/>
-          <w14:ligatures w14:val="none"/>
-        </w:rPr>
-      </w:pPr>
-      <w:r>
-        <w:rPr>
-          <w:rFonts w:ascii="Arial" w:eastAsia="Times New Roman" w:hAnsi="Arial" w:cs="Arial"/>
-          <w:b/>
-          <w:bCs/>
-          <w:kern w:val="0"/>
-          <w:lang w:eastAsia="es-CO"/>
-          <w14:ligatures w14:val="none"/>
-        </w:rPr>
-        <w:lastRenderedPageBreak/>
-        <w:t>CP-25:</w:t>
-      </w:r>
-      <w:r>
-        <w:rPr>
-          <w:rFonts w:ascii="Arial" w:eastAsia="Times New Roman" w:hAnsi="Arial" w:cs="Arial"/>
-          <w:kern w:val="0"/>
-          <w:lang w:eastAsia="es-CO"/>
-          <w14:ligatures w14:val="none"/>
-        </w:rPr>
-        <w:t xml:space="preserve"> Rechazo de solicitud al enviar el formulario con campos obligatorios vacíos. </w:t>
-      </w:r>
-    </w:p>
-    <w:p>
-      <w:pPr>
-        <w:spacing w:before="100" w:beforeAutospacing="1" w:after="100" w:afterAutospacing="1" w:line="240" w:lineRule="auto"/>
-        <w:rPr>
-          <w:rFonts w:ascii="Arial" w:eastAsia="Times New Roman" w:hAnsi="Arial" w:cs="Arial"/>
-          <w:kern w:val="0"/>
-          <w:lang w:eastAsia="es-CO"/>
-          <w14:ligatures w14:val="none"/>
-        </w:rPr>
-      </w:pPr>
-      <w:r>
-        <w:rPr>
-          <w:rFonts w:ascii="Arial" w:eastAsia="Times New Roman" w:hAnsi="Arial" w:cs="Arial"/>
-          <w:b/>
-          <w:bCs/>
-          <w:kern w:val="0"/>
-          <w:lang w:eastAsia="es-CO"/>
-          <w14:ligatures w14:val="none"/>
-        </w:rPr>
-        <w:t>CP-31:</w:t>
-      </w:r>
-      <w:r>
-        <w:rPr>
-          <w:rFonts w:ascii="Arial" w:eastAsia="Times New Roman" w:hAnsi="Arial" w:cs="Arial"/>
-          <w:kern w:val="0"/>
-          <w:lang w:eastAsia="es-CO"/>
-          <w14:ligatures w14:val="none"/>
-        </w:rPr>
-        <w:t xml:space="preserve"> Notificación de "no encontrado" al ingresar un número identificador inexistente o inválido</w:t>
-      </w:r>
-    </w:p>
-    <w:p>
-      <w:pPr>
-        <w:pStyle w:val="NormalWeb"/>
-        <w:rPr>
-          <w:rFonts w:ascii="Arial" w:hAnsi="Arial" w:cs="Arial"/>
-          <w:b/>
-          <w:bCs/>
-          <w:sz w:val="22"/>
-          <w:szCs w:val="22"/>
-        </w:rPr>
-      </w:pPr>
-    </w:p>
-    <w:p>
-      <w:pPr>
-        <w:pStyle w:val="NormalWeb"/>
-        <w:jc w:val="center"/>
-        <w:rPr>
-          <w:rFonts w:ascii="Arial" w:hAnsi="Arial" w:cs="Arial"/>
-          <w:b/>
-          <w:bCs/>
-          <w:sz w:val="22"/>
-          <w:szCs w:val="22"/>
-        </w:rPr>
-      </w:pPr>
-      <w:r>
-        <w:rPr>
-          <w:rFonts w:ascii="Arial" w:hAnsi="Arial" w:cs="Arial"/>
-          <w:b/>
-          <w:bCs/>
-          <w:sz w:val="22"/>
-          <w:szCs w:val="22"/>
-        </w:rPr>
-        <w:t xml:space="preserve">¿QUE </w:t>
-      </w:r>
-      <w:r>
-        <w:rPr>
-          <w:rFonts w:ascii="Arial" w:hAnsi="Arial" w:cs="Arial"/>
-          <w:b/>
-          <w:bCs/>
-          <w:sz w:val="22"/>
-          <w:szCs w:val="22"/>
-        </w:rPr>
-        <w:t>CAMBIOS DEBERIA REALIZAR</w:t>
-      </w:r>
-      <w:r>
-        <w:rPr>
-          <w:rFonts w:ascii="Arial" w:hAnsi="Arial" w:cs="Arial"/>
-          <w:b/>
-          <w:bCs/>
-          <w:sz w:val="22"/>
-          <w:szCs w:val="22"/>
-        </w:rPr>
-        <w:t>SE</w:t>
-      </w:r>
-      <w:r>
-        <w:rPr>
-          <w:rFonts w:ascii="Arial" w:hAnsi="Arial" w:cs="Arial"/>
-          <w:b/>
-          <w:bCs/>
-          <w:sz w:val="22"/>
-          <w:szCs w:val="22"/>
-        </w:rPr>
-        <w:t xml:space="preserve"> EL SOFTWARE</w:t>
-      </w:r>
-      <w:r>
-        <w:rPr>
-          <w:rFonts w:ascii="Arial" w:hAnsi="Arial" w:cs="Arial"/>
-          <w:b/>
-          <w:bCs/>
-          <w:sz w:val="22"/>
-          <w:szCs w:val="22"/>
-        </w:rPr>
-        <w:t>?</w:t>
-      </w:r>
-    </w:p>
-    <w:p>
-      <w:pPr>
-        <w:spacing w:before="100" w:beforeAutospacing="1" w:after="100" w:afterAutospacing="1" w:line="240" w:lineRule="auto"/>
-        <w:rPr>
-          <w:rFonts w:ascii="Arial" w:eastAsia="Times New Roman" w:hAnsi="Arial" w:cs="Arial"/>
-          <w:kern w:val="0"/>
-          <w:lang w:eastAsia="es-CO"/>
-          <w14:ligatures w14:val="none"/>
-        </w:rPr>
-      </w:pPr>
-      <w:r>
-        <w:rPr>
-          <w:rFonts w:ascii="Arial" w:eastAsia="Times New Roman" w:hAnsi="Arial" w:cs="Arial"/>
-          <w:b/>
-          <w:bCs/>
-          <w:kern w:val="0"/>
-          <w:lang w:eastAsia="es-CO"/>
-          <w14:ligatures w14:val="none"/>
-        </w:rPr>
-        <w:t>Normalización de la numeración de requerimientos:</w:t>
-      </w:r>
-      <w:r>
-        <w:rPr>
-          <w:rFonts w:ascii="Arial" w:eastAsia="Times New Roman" w:hAnsi="Arial" w:cs="Arial"/>
-          <w:kern w:val="0"/>
-          <w:lang w:eastAsia="es-CO"/>
-          <w14:ligatures w14:val="none"/>
-        </w:rPr>
-        <w:t xml:space="preserve"> Corregir el desfasaje en los identificadores entre el documento de Requisitos y los Casos de Pruebas (por ejemplo, alinear el RF-04/RF-18, RF-05/RF-19, RF-06/RF-20 y RF-07/RF-21). </w:t>
-      </w:r>
-    </w:p>
-    <w:p>
-      <w:pPr>
-        <w:spacing w:before="100" w:beforeAutospacing="1" w:after="100" w:afterAutospacing="1" w:line="240" w:lineRule="auto"/>
-        <w:rPr>
-          <w:rFonts w:ascii="Arial" w:eastAsia="Times New Roman" w:hAnsi="Arial" w:cs="Arial"/>
-          <w:kern w:val="0"/>
-          <w:lang w:eastAsia="es-CO"/>
-          <w14:ligatures w14:val="none"/>
-        </w:rPr>
-      </w:pPr>
-      <w:r>
-        <w:rPr>
-          <w:rFonts w:ascii="Arial" w:eastAsia="Times New Roman" w:hAnsi="Arial" w:cs="Arial"/>
-          <w:b/>
-          <w:bCs/>
-          <w:kern w:val="0"/>
-          <w:lang w:eastAsia="es-CO"/>
-          <w14:ligatures w14:val="none"/>
-        </w:rPr>
-        <w:t>Desarrollo del módulo de filtrado:</w:t>
-      </w:r>
-      <w:r>
-        <w:rPr>
-          <w:rFonts w:ascii="Arial" w:eastAsia="Times New Roman" w:hAnsi="Arial" w:cs="Arial"/>
-          <w:kern w:val="0"/>
-          <w:lang w:eastAsia="es-CO"/>
-          <w14:ligatures w14:val="none"/>
-        </w:rPr>
-        <w:t xml:space="preserve"> Diseñar e incorporar las pruebas y componentes necesarios para cumplir con la funcionalidad de filtrado de solicitudes por estado para los funcionarios (RF-08). </w:t>
-      </w:r>
-    </w:p>
-    <w:p>
-      <w:pPr>
-        <w:spacing w:before="100" w:beforeAutospacing="1" w:after="100" w:afterAutospacing="1" w:line="240" w:lineRule="auto"/>
-        <w:rPr>
-          <w:rFonts w:ascii="Arial" w:eastAsia="Times New Roman" w:hAnsi="Arial" w:cs="Arial"/>
-          <w:kern w:val="0"/>
-          <w:lang w:eastAsia="es-CO"/>
-          <w14:ligatures w14:val="none"/>
-        </w:rPr>
-      </w:pPr>
-      <w:r>
-        <w:rPr>
-          <w:rFonts w:ascii="Arial" w:eastAsia="Times New Roman" w:hAnsi="Arial" w:cs="Arial"/>
-          <w:b/>
-          <w:bCs/>
-          <w:kern w:val="0"/>
-          <w:lang w:eastAsia="es-CO"/>
-          <w14:ligatures w14:val="none"/>
-        </w:rPr>
-        <w:t>Ajuste de validaciones en casos de prueba:</w:t>
-      </w:r>
-      <w:r>
-        <w:rPr>
-          <w:rFonts w:ascii="Arial" w:eastAsia="Times New Roman" w:hAnsi="Arial" w:cs="Arial"/>
-          <w:kern w:val="0"/>
-          <w:lang w:eastAsia="es-CO"/>
-          <w14:ligatures w14:val="none"/>
-        </w:rPr>
-        <w:t xml:space="preserve"> Corregir duplicidades observadas en la redacción de entradas/resultados en casos de prueba como el CP-31. </w:t>
-      </w:r>
-    </w:p>
-    <w:p>
-      <w:pPr>
-        <w:pStyle w:val="NormalWeb"/>
-        <w:jc w:val="center"/>
-        <w:rPr>
-          <w:rFonts w:ascii="Arial" w:hAnsi="Arial" w:cs="Arial"/>
-          <w:b/>
-          <w:bCs/>
-          <w:sz w:val="22"/>
-          <w:szCs w:val="22"/>
-        </w:rPr>
-      </w:pPr>
-    </w:p>
-    <w:p>
-      <w:pPr>
-        <w:pStyle w:val="NormalWeb"/>
-        <w:jc w:val="center"/>
-        <w:rPr>
-          <w:rFonts w:ascii="Arial" w:hAnsi="Arial" w:cs="Arial"/>
-          <w:b/>
-          <w:bCs/>
-          <w:sz w:val="22"/>
-          <w:szCs w:val="22"/>
-        </w:rPr>
-      </w:pPr>
-      <w:r>
-        <w:rPr>
-          <w:rFonts w:ascii="Arial" w:hAnsi="Arial" w:cs="Arial"/>
-          <w:b/>
-          <w:bCs/>
-          <w:sz w:val="22"/>
-          <w:szCs w:val="22"/>
-        </w:rPr>
-        <w:t>¿</w:t>
-      </w:r>
-      <w:r>
-        <w:rPr>
-          <w:rFonts w:ascii="Arial" w:hAnsi="Arial" w:cs="Arial"/>
-          <w:b/>
-          <w:bCs/>
-          <w:sz w:val="22"/>
-          <w:szCs w:val="22"/>
-        </w:rPr>
-        <w:t>CÓMO DEMOSTRARÍAN ANTE LA ORGANIZACIÓN QUE LA SOLUCIÓN CUMPLE LOS REQUERIMIENTOS?</w:t>
-      </w:r>
-    </w:p>
-    <w:p>
-      <w:pPr>
-        <w:spacing w:before="100" w:beforeAutospacing="1" w:after="100" w:afterAutospacing="1" w:line="240" w:lineRule="auto"/>
-        <w:rPr>
-          <w:rFonts w:ascii="Arial" w:eastAsia="Times New Roman" w:hAnsi="Arial" w:cs="Arial"/>
-          <w:kern w:val="0"/>
-          <w:lang w:eastAsia="es-CO"/>
-          <w14:ligatures w14:val="none"/>
-        </w:rPr>
-      </w:pPr>
-      <w:r>
-        <w:rPr>
-          <w:rFonts w:ascii="Arial" w:eastAsia="Times New Roman" w:hAnsi="Arial" w:cs="Arial"/>
-          <w:b/>
-          <w:bCs/>
-          <w:kern w:val="0"/>
-          <w:lang w:eastAsia="es-CO"/>
-          <w14:ligatures w14:val="none"/>
-        </w:rPr>
-        <w:t>Matriz de Trazabilidad:</w:t>
-      </w:r>
-      <w:r>
-        <w:rPr>
-          <w:rFonts w:ascii="Arial" w:eastAsia="Times New Roman" w:hAnsi="Arial" w:cs="Arial"/>
-          <w:kern w:val="0"/>
-          <w:lang w:eastAsia="es-CO"/>
-          <w14:ligatures w14:val="none"/>
-        </w:rPr>
-        <w:t xml:space="preserve"> Presentando el cruce entre los Requisitos Funcionales (RF-01 al RF-07/RF-15 a RF-21) y los Casos de Prueba mapeados (CP-01 al CP-31). </w:t>
-      </w:r>
-    </w:p>
-    <w:p>
-      <w:pPr>
-        <w:spacing w:before="100" w:beforeAutospacing="1" w:after="100" w:afterAutospacing="1" w:line="240" w:lineRule="auto"/>
+        <w:jc w:val="both"/>
         <w:rPr>
           <w:rFonts w:ascii="Times New Roman" w:eastAsia="Times New Roman" w:hAnsi="Times New Roman" w:cs="Times New Roman"/>
           <w:kern w:val="0"/>
@@ -1812,7 +1769,7 @@
     <w:p>
       <w:pPr>
         <w:pStyle w:val="NormalWeb"/>
-        <w:jc w:val="center"/>
+        <w:jc w:val="both"/>
         <w:rPr>
           <w:rFonts w:ascii="Arial" w:hAnsi="Arial" w:cs="Arial"/>
           <w:b/>
@@ -1825,7 +1782,7 @@
     <w:p>
       <w:pPr>
         <w:pStyle w:val="NormalWeb"/>
-        <w:jc w:val="center"/>
+        <w:jc w:val="both"/>
         <w:rPr>
           <w:rFonts w:ascii="Arial" w:hAnsi="Arial" w:cs="Arial"/>
           <w:sz w:val="22"/>
@@ -1836,6 +1793,7 @@
     <w:p>
       <w:pPr>
         <w:pStyle w:val="NormalWeb"/>
+        <w:jc w:val="both"/>
         <w:rPr>
           <w:rFonts w:ascii="Arial" w:hAnsi="Arial" w:cs="Arial"/>
           <w:sz w:val="22"/>
@@ -1846,18 +1804,19 @@
     <w:p>
       <w:pPr>
         <w:pStyle w:val="NormalWeb"/>
-        <w:jc w:val="center"/>
-        <w:rPr>
-          <w:rFonts w:ascii="Arial" w:hAnsi="Arial" w:cs="Arial"/>
-          <w:b/>
-          <w:bCs/>
-          <w:sz w:val="22"/>
-          <w:szCs w:val="22"/>
-        </w:rPr>
-      </w:pPr>
-    </w:p>
-    <w:p>
-      <w:pPr>
+        <w:jc w:val="both"/>
+        <w:rPr>
+          <w:rFonts w:ascii="Arial" w:hAnsi="Arial" w:cs="Arial"/>
+          <w:b/>
+          <w:bCs/>
+          <w:sz w:val="22"/>
+          <w:szCs w:val="22"/>
+        </w:rPr>
+      </w:pPr>
+    </w:p>
+    <w:p>
+      <w:pPr>
+        <w:jc w:val="both"/>
         <w:rPr>
           <w:rFonts w:ascii="Arial" w:hAnsi="Arial" w:cs="Arial"/>
           <w:b/>
@@ -1876,7 +1835,7 @@
 </file>
 
 <file path=word/numbering.xml><?xml version="1.0" encoding="utf-8"?>
-<w:numbering xmlns:wpc="http://schemas.microsoft.com/office/word/2010/wordprocessingCanvas" xmlns:cx="http://schemas.microsoft.com/office/drawing/2014/chartex" xmlns:cx1="http://schemas.microsoft.com/office/drawing/2015/9/8/chartex" xmlns:cx2="http://schemas.microsoft.com/office/drawing/2015/10/21/chartex" xmlns:cx3="http://schemas.microsoft.com/office/drawing/2016/5/9/chartex" xmlns:cx4="http://schemas.microsoft.com/office/drawing/2016/5/10/chartex" xmlns:cx5="http://schemas.microsoft.com/office/drawing/2016/5/11/chartex" xmlns:cx6="http://schemas.microsoft.com/office/drawing/2016/5/12/chartex" xmlns:cx7="http://schemas.microsoft.com/office/drawing/2016/5/13/chartex" xmlns:cx8="http://schemas.microsoft.com/office/drawing/2016/5/14/chartex" xmlns:mc="http://schemas.openxmlformats.org/markup-compatibility/2006" xmlns:aink="http://schemas.microsoft.com/office/drawing/2016/ink" xmlns:am3d="http://schemas.microsoft.com/office/drawing/2017/model3d" xmlns:o="urn:schemas-microsoft-com:office:office" xmlns:r="http://schemas.openxmlformats.org/officeDocument/2006/relationships" xmlns:m="http://schemas.openxmlformats.org/officeDocument/2006/math" xmlns:v="urn:schemas-microsoft-com:vml" xmlns:wp14="http://schemas.microsoft.com/office/word/2010/wordprocessingDrawing" xmlns:wp="http://schemas.openxmlformats.org/drawingml/2006/wordprocessingDrawing" xmlns:w10="urn:schemas-microsoft-com:office:word" xmlns:w="http://schemas.openxmlformats.org/wordprocessingml/2006/main" xmlns:w14="http://schemas.microsoft.com/office/word/2010/wordml" xmlns:w15="http://schemas.microsoft.com/office/word/2012/wordml" xmlns:w16cex="http://schemas.microsoft.com/office/word/2018/wordml/cex" xmlns:w16cid="http://schemas.microsoft.com/office/word/2016/wordml/cid" xmlns:w16="http://schemas.microsoft.com/office/word/2018/wordml" xmlns:w16sdtdh="http://schemas.microsoft.com/office/word/2020/wordml/sdtdatahash" xmlns:w16se="http://schemas.microsoft.com/office/word/2015/wordml/symex" xmlns:wpg="http://schemas.microsoft.com/office/word/2010/wordprocessingGroup" xmlns:wpi="http://schemas.microsoft.com/office/word/2010/wordprocessingInk" xmlns:wne="http://schemas.microsoft.com/office/word/2006/wordml" xmlns:wps="http://schemas.microsoft.com/office/word/2010/wordprocessingShape" mc:Ignorable="w14 w15 w16se w16cid w16 w16cex w16sdtdh wp14">
+<w:numbering xmlns:wpc="http://schemas.microsoft.com/office/word/2010/wordprocessingCanvas" xmlns:cx="http://schemas.microsoft.com/office/drawing/2014/chartex" xmlns:cx1="http://schemas.microsoft.com/office/drawing/2015/9/8/chartex" xmlns:cx2="http://schemas.microsoft.com/office/drawing/2015/10/21/chartex" xmlns:cx3="http://schemas.microsoft.com/office/drawing/2016/5/9/chartex" xmlns:cx4="http://schemas.microsoft.com/office/drawing/2016/5/10/chartex" xmlns:cx5="http://schemas.microsoft.com/office/drawing/2016/5/11/chartex" xmlns:cx6="http://schemas.microsoft.com/office/drawing/2016/5/12/chartex" xmlns:cx7="http://schemas.microsoft.com/office/drawing/2016/5/13/chartex" xmlns:cx8="http://schemas.microsoft.com/office/drawing/2016/5/14/chartex" xmlns:mc="http://schemas.openxmlformats.org/markup-compatibility/2006" xmlns:aink="http://schemas.microsoft.com/office/drawing/2016/ink" xmlns:am3d="http://schemas.microsoft.com/office/drawing/2017/model3d" xmlns:o="urn:schemas-microsoft-com:office:office" xmlns:r="http://schemas.openxmlformats.org/officeDocument/2006/relationships" xmlns:m="http://schemas.openxmlformats.org/officeDocument/2006/math" xmlns:v="urn:schemas-microsoft-com:vml" xmlns:wp14="http://schemas.microsoft.com/office/word/2010/wordprocessingDrawing" xmlns:wp="http://schemas.openxmlformats.org/drawingml/2006/wordprocessingDrawing" xmlns:w10="urn:schemas-microsoft-com:office:word" xmlns:w="http://schemas.openxmlformats.org/wordprocessingml/2006/main" xmlns:w14="http://schemas.microsoft.com/office/word/2010/wordml" xmlns:w15="http://schemas.microsoft.com/office/word/2012/wordml" xmlns:w16cid="http://schemas.microsoft.com/office/word/2016/wordml/cid" xmlns:w16se="http://schemas.microsoft.com/office/word/2015/wordml/symex" xmlns:wpg="http://schemas.microsoft.com/office/word/2010/wordprocessingGroup" xmlns:wpi="http://schemas.microsoft.com/office/word/2010/wordprocessingInk" xmlns:wne="http://schemas.microsoft.com/office/word/2006/wordml" xmlns:wps="http://schemas.microsoft.com/office/word/2010/wordprocessingShape" mc:Ignorable="w14 w15 w16se w16cid wp14">
   <w:abstractNum w:abstractNumId="0" w15:restartNumberingAfterBreak="0">
     <w:nsid w:val="302248C2"/>
     <w:multiLevelType w:val="multilevel"/>
@@ -2337,7 +2296,7 @@
 </file>
 
 <file path=word/styles.xml><?xml version="1.0" encoding="utf-8"?>
-<w:styles xmlns:mc="http://schemas.openxmlformats.org/markup-compatibility/2006" xmlns:r="http://schemas.openxmlformats.org/officeDocument/2006/relationships" xmlns:w="http://schemas.openxmlformats.org/wordprocessingml/2006/main" xmlns:w14="http://schemas.microsoft.com/office/word/2010/wordml" xmlns:w15="http://schemas.microsoft.com/office/word/2012/wordml" xmlns:w16cex="http://schemas.microsoft.com/office/word/2018/wordml/cex" xmlns:w16cid="http://schemas.microsoft.com/office/word/2016/wordml/cid" xmlns:w16="http://schemas.microsoft.com/office/word/2018/wordml" xmlns:w16sdtdh="http://schemas.microsoft.com/office/word/2020/wordml/sdtdatahash" xmlns:w16se="http://schemas.microsoft.com/office/word/2015/wordml/symex" mc:Ignorable="w14 w15 w16se w16cid w16 w16cex w16sdtdh">
+<w:styles xmlns:mc="http://schemas.openxmlformats.org/markup-compatibility/2006" xmlns:r="http://schemas.openxmlformats.org/officeDocument/2006/relationships" xmlns:w="http://schemas.openxmlformats.org/wordprocessingml/2006/main" xmlns:w14="http://schemas.microsoft.com/office/word/2010/wordml" xmlns:w15="http://schemas.microsoft.com/office/word/2012/wordml" xmlns:w16cid="http://schemas.microsoft.com/office/word/2016/wordml/cid" xmlns:w16se="http://schemas.microsoft.com/office/word/2015/wordml/symex" mc:Ignorable="w14 w15 w16se w16cid">
   <w:docDefaults>
     <w:rPrDefault>
       <w:rPr>

</xml_diff>